<commit_message>
Improve Stage 2 capstone guidance and materials
</commit_message>
<xml_diff>
--- a/CAPSTONE/bus311-capstone-assignment.docx
+++ b/CAPSTONE/bus311-capstone-assignment.docx
@@ -45,7 +45,7 @@
           <w:color w:val="5B6472"/>
           <w:sz w:val="18"/>
         </w:rPr>
-        <w:t>100 points  |  25% of BUS311  |  Individual project  |  Fall 2026  |  Source v1.4.0</w:t>
+        <w:t>100 points  |  25% of BUS311  |  Individual project  |  Fall 2026  |  Source v1.5.0</w:t>
       </w:r>
     </w:p>
     <w:p>
@@ -2197,20 +2197,80 @@
         <w:t>Wednesday, Sept. 30, 2026 at 12:30 p.m. ET (class-start time)</w:t>
       </w:r>
     </w:p>
+    <w:tbl>
+      <w:tblPr>
+        <w:tblStyle w:val="TableGrid"/>
+        <w:tblW w:type="dxa" w:w="9360"/>
+        <w:jc w:val="left"/>
+        <w:tblLayout w:type="fixed"/>
+        <w:tblLook w:firstColumn="1" w:firstRow="1" w:lastColumn="0" w:lastRow="0" w:noHBand="0" w:noVBand="1" w:val="04A0"/>
+        <w:tblInd w:w="120" w:type="dxa"/>
+      </w:tblPr>
+      <w:tblGrid>
+        <w:gridCol w:w="9360"/>
+      </w:tblGrid>
+      <w:tr>
+        <w:trPr>
+          <w:cantSplit/>
+        </w:trPr>
+        <w:tc>
+          <w:tcPr>
+            <w:tcW w:type="dxa" w:w="9360"/>
+            <w:shd w:fill="FFF4DF"/>
+            <w:tcMar>
+              <w:top w:w="100" w:type="dxa"/>
+              <w:start w:w="120" w:type="dxa"/>
+              <w:bottom w:w="100" w:type="dxa"/>
+              <w:end w:w="120" w:type="dxa"/>
+            </w:tcMar>
+            <w:vAlign w:val="center"/>
+          </w:tcPr>
+          <w:p>
+            <w:pPr>
+              <w:spacing w:after="40"/>
+            </w:pPr>
+            <w:r>
+              <w:rPr>
+                <w:rFonts w:ascii="Aptos" w:hAnsi="Aptos"/>
+                <w:b/>
+                <w:i w:val="0"/>
+                <w:color w:val="9C4A2B"/>
+                <w:sz w:val="19"/>
+              </w:rPr>
+              <w:t xml:space="preserve">SUBMIT ONE REQUIRED FILE  </w:t>
+            </w:r>
+            <w:r>
+              <w:rPr>
+                <w:rFonts w:ascii="Aptos" w:hAnsi="Aptos"/>
+                <w:b w:val="0"/>
+                <w:i w:val="0"/>
+                <w:color w:val="152536"/>
+                <w:sz w:val="21"/>
+              </w:rPr>
+              <w:t>Upload one required file in the designated Canvas assignment: the completed BUS311 Capstone Revenue Analysis Workbook (.xlsx), including the Hypothesis &amp; Scenarios sheet. Do not create or upload a separate PDF or DOCX unless Canvas or the instructor explicitly requests an additional readable export.</w:t>
+            </w:r>
+          </w:p>
+        </w:tc>
+      </w:tr>
+    </w:tbl>
     <w:p>
       <w:pPr>
-        <w:spacing w:after="100"/>
+        <w:spacing w:after="20"/>
+      </w:pPr>
+    </w:p>
+    <w:p>
+      <w:pPr>
+        <w:pStyle w:val="Heading2"/>
+        <w:keepNext/>
       </w:pPr>
       <w:r>
-        <w:rPr>
-          <w:rFonts w:ascii="Aptos" w:hAnsi="Aptos"/>
-          <w:b/>
-          <w:i w:val="0"/>
-          <w:color w:val="1A1F2C"/>
-          <w:sz w:val="21"/>
-        </w:rPr>
-        <w:t xml:space="preserve">Submit: </w:t>
+        <w:t>Stage 2 start here</w:t>
       </w:r>
+    </w:p>
+    <w:p>
+      <w:pPr>
+        <w:pStyle w:val="ListNumber"/>
+      </w:pPr>
       <w:r>
         <w:rPr>
           <w:rFonts w:ascii="Aptos" w:hAnsi="Aptos"/>
@@ -2219,8 +2279,129 @@
           <w:color w:val="1A1F2C"/>
           <w:sz w:val="21"/>
         </w:rPr>
-        <w:t>Revenue analysis workbook with hypothesis.</w:t>
+        <w:t>Read the Revenue Engine Student Guide: Use the scope limits and eight-step workflow before collecting data. File: Revenue-engine student guide.</w:t>
       </w:r>
+    </w:p>
+    <w:p>
+      <w:pPr>
+        <w:pStyle w:val="ListNumber"/>
+      </w:pPr>
+      <w:r>
+        <w:rPr>
+          <w:rFonts w:ascii="Aptos" w:hAnsi="Aptos"/>
+          <w:b w:val="0"/>
+          <w:i w:val="0"/>
+          <w:color w:val="1A1F2C"/>
+          <w:sz w:val="21"/>
+        </w:rPr>
+        <w:t>Complete the Revenue Analysis Workbook: Work through the nine visible sheets in order and maintain the Evidence Register as you go. File: Revenue analysis workbook.</w:t>
+      </w:r>
+    </w:p>
+    <w:p>
+      <w:pPr>
+        <w:pStyle w:val="ListNumber"/>
+      </w:pPr>
+      <w:r>
+        <w:rPr>
+          <w:rFonts w:ascii="Aptos" w:hAnsi="Aptos"/>
+          <w:b w:val="0"/>
+          <w:i w:val="0"/>
+          <w:color w:val="1A1F2C"/>
+          <w:sz w:val="21"/>
+        </w:rPr>
+        <w:t>Test the hypothesis twice: Use the checklist before the skeptical-CFO challenge and again after revising the hypothesis. File: Revenue-hypothesis quality checklist.</w:t>
+      </w:r>
+    </w:p>
+    <w:p>
+      <w:pPr>
+        <w:pStyle w:val="ListNumber"/>
+      </w:pPr>
+      <w:r>
+        <w:rPr>
+          <w:rFonts w:ascii="Aptos" w:hAnsi="Aptos"/>
+          <w:b w:val="0"/>
+          <w:i w:val="0"/>
+          <w:color w:val="1A1F2C"/>
+          <w:sz w:val="21"/>
+        </w:rPr>
+        <w:t>Check the eight-point rubric: Compare the completed workbook with every criterion before submission. File: Revenue milestone rubric.</w:t>
+      </w:r>
+    </w:p>
+    <w:p>
+      <w:pPr>
+        <w:pStyle w:val="ListNumber"/>
+      </w:pPr>
+      <w:r>
+        <w:rPr>
+          <w:rFonts w:ascii="Aptos" w:hAnsi="Aptos"/>
+          <w:b w:val="0"/>
+          <w:i w:val="0"/>
+          <w:color w:val="1A1F2C"/>
+          <w:sz w:val="21"/>
+        </w:rPr>
+        <w:t>Resolve checks and submit: Review Checks &amp; Submission, explain honest limitations, and upload the completed .xlsx in Canvas. File: Revenue analysis workbook.</w:t>
+      </w:r>
+    </w:p>
+    <w:tbl>
+      <w:tblPr>
+        <w:tblStyle w:val="TableGrid"/>
+        <w:tblW w:type="dxa" w:w="9360"/>
+        <w:jc w:val="left"/>
+        <w:tblLayout w:type="fixed"/>
+        <w:tblLook w:firstColumn="1" w:firstRow="1" w:lastColumn="0" w:lastRow="0" w:noHBand="0" w:noVBand="1" w:val="04A0"/>
+        <w:tblInd w:w="120" w:type="dxa"/>
+      </w:tblPr>
+      <w:tblGrid>
+        <w:gridCol w:w="9360"/>
+      </w:tblGrid>
+      <w:tr>
+        <w:trPr>
+          <w:cantSplit/>
+        </w:trPr>
+        <w:tc>
+          <w:tcPr>
+            <w:tcW w:type="dxa" w:w="9360"/>
+            <w:shd w:fill="EDF3F7"/>
+            <w:tcMar>
+              <w:top w:w="100" w:type="dxa"/>
+              <w:start w:w="120" w:type="dxa"/>
+              <w:bottom w:w="100" w:type="dxa"/>
+              <w:end w:w="120" w:type="dxa"/>
+            </w:tcMar>
+            <w:vAlign w:val="center"/>
+          </w:tcPr>
+          <w:p>
+            <w:pPr>
+              <w:spacing w:after="40"/>
+            </w:pPr>
+            <w:r>
+              <w:rPr>
+                <w:rFonts w:ascii="Aptos" w:hAnsi="Aptos"/>
+                <w:b/>
+                <w:i w:val="0"/>
+                <w:color w:val="355773"/>
+                <w:sz w:val="19"/>
+              </w:rPr>
+              <w:t xml:space="preserve">NEED FACTSET ACCESS OR THE EXCEL ADD-IN?  </w:t>
+            </w:r>
+            <w:r>
+              <w:rPr>
+                <w:rFonts w:ascii="Aptos" w:hAnsi="Aptos"/>
+                <w:b w:val="0"/>
+                <w:i w:val="0"/>
+                <w:color w:val="152536"/>
+                <w:sz w:val="21"/>
+              </w:rPr>
+              <w:t>Use the course FactSet activation and Excel setup page before beginning the workbook. Keep raw FactSet exports and screenshots inside approved course-restricted systems. https://endicott.instructure.com/courses/58525/pages/activate-factset-and-add-it-to-excel</w:t>
+            </w:r>
+          </w:p>
+        </w:tc>
+      </w:tr>
+    </w:tbl>
+    <w:p>
+      <w:pPr>
+        <w:spacing w:after="20"/>
+      </w:pPr>
     </w:p>
     <w:p>
       <w:pPr>
@@ -2311,6 +2492,151 @@
         </w:rPr>
         <w:t>• Verify the strongest retained AI challenge and record an accept, modify, or reject judgment.</w:t>
       </w:r>
+    </w:p>
+    <w:p>
+      <w:pPr>
+        <w:pStyle w:val="Heading2"/>
+        <w:keepNext/>
+      </w:pPr>
+      <w:r>
+        <w:t>Common Stage 2 edge cases</w:t>
+      </w:r>
+    </w:p>
+    <w:p>
+      <w:pPr>
+        <w:ind w:left="317" w:hanging="317"/>
+      </w:pPr>
+      <w:r>
+        <w:rPr>
+          <w:rFonts w:ascii="Aptos" w:hAnsi="Aptos"/>
+          <w:b w:val="0"/>
+          <w:i w:val="0"/>
+          <w:color w:val="1A1F2C"/>
+          <w:sz w:val="21"/>
+        </w:rPr>
+        <w:t>• Fewer than three defensible peers: Use the defensible peers available and explain why additional companies are not sufficiently comparable.</w:t>
+      </w:r>
+    </w:p>
+    <w:p>
+      <w:pPr>
+        <w:ind w:left="317" w:hanging="317"/>
+      </w:pPr>
+      <w:r>
+        <w:rPr>
+          <w:rFonts w:ascii="Aptos" w:hAnsi="Aptos"/>
+          <w:b w:val="0"/>
+          <w:i w:val="0"/>
+          <w:color w:val="1A1F2C"/>
+          <w:sz w:val="21"/>
+        </w:rPr>
+        <w:t>• A segment, market-share measure, or driver is not disclosed: State the limitation, use a supportable proxy only when its definition is clear, and never invent a figure.</w:t>
+      </w:r>
+    </w:p>
+    <w:p>
+      <w:pPr>
+        <w:ind w:left="317" w:hanging="317"/>
+      </w:pPr>
+      <w:r>
+        <w:rPr>
+          <w:rFonts w:ascii="Aptos" w:hAnsi="Aptos"/>
+          <w:b w:val="0"/>
+          <w:i w:val="0"/>
+          <w:color w:val="1A1F2C"/>
+          <w:sz w:val="21"/>
+        </w:rPr>
+        <w:t>• Definitions changed across years: Reconcile or disclose restatements, acquisitions, divestitures, fiscal-year changes, and segment-definition changes before comparing growth.</w:t>
+      </w:r>
+    </w:p>
+    <w:p>
+      <w:pPr>
+        <w:ind w:left="317" w:hanging="317"/>
+      </w:pPr>
+      <w:r>
+        <w:rPr>
+          <w:rFonts w:ascii="Aptos" w:hAnsi="Aptos"/>
+          <w:b w:val="0"/>
+          <w:i w:val="0"/>
+          <w:color w:val="1A1F2C"/>
+          <w:sz w:val="21"/>
+        </w:rPr>
+        <w:t>• A driver cannot be quantified: Classify it as directional, cite the supporting evidence, and state what would be needed to quantify it.</w:t>
+      </w:r>
+    </w:p>
+    <w:p>
+      <w:pPr>
+        <w:ind w:left="317" w:hanging="317"/>
+      </w:pPr>
+      <w:r>
+        <w:rPr>
+          <w:rFonts w:ascii="Aptos" w:hAnsi="Aptos"/>
+          <w:b w:val="0"/>
+          <w:i w:val="0"/>
+          <w:color w:val="1A1F2C"/>
+          <w:sz w:val="21"/>
+        </w:rPr>
+        <w:t>• Using AI or the non-AI path: Either path must produce the same skeptical-CFO challenge record. AI output is not evidence, and raw FactSet files or screenshots may not be uploaded to public AI tools.</w:t>
+      </w:r>
+    </w:p>
+    <w:tbl>
+      <w:tblPr>
+        <w:tblStyle w:val="TableGrid"/>
+        <w:tblW w:type="dxa" w:w="9360"/>
+        <w:jc w:val="left"/>
+        <w:tblLayout w:type="fixed"/>
+        <w:tblLook w:firstColumn="1" w:firstRow="1" w:lastColumn="0" w:lastRow="0" w:noHBand="0" w:noVBand="1" w:val="04A0"/>
+        <w:tblInd w:w="120" w:type="dxa"/>
+      </w:tblPr>
+      <w:tblGrid>
+        <w:gridCol w:w="9360"/>
+      </w:tblGrid>
+      <w:tr>
+        <w:trPr>
+          <w:cantSplit/>
+        </w:trPr>
+        <w:tc>
+          <w:tcPr>
+            <w:tcW w:type="dxa" w:w="9360"/>
+            <w:shd w:fill="EDF3F7"/>
+            <w:tcMar>
+              <w:top w:w="100" w:type="dxa"/>
+              <w:start w:w="120" w:type="dxa"/>
+              <w:bottom w:w="100" w:type="dxa"/>
+              <w:end w:w="120" w:type="dxa"/>
+            </w:tcMar>
+            <w:vAlign w:val="center"/>
+          </w:tcPr>
+          <w:p>
+            <w:pPr>
+              <w:spacing w:after="40"/>
+            </w:pPr>
+            <w:r>
+              <w:rPr>
+                <w:rFonts w:ascii="Aptos" w:hAnsi="Aptos"/>
+                <w:b/>
+                <w:i w:val="0"/>
+                <w:color w:val="355773"/>
+                <w:sz w:val="19"/>
+              </w:rPr>
+              <w:t xml:space="preserve">WHAT PASS MEANS  </w:t>
+            </w:r>
+            <w:r>
+              <w:rPr>
+                <w:rFonts w:ascii="Aptos" w:hAnsi="Aptos"/>
+                <w:b w:val="0"/>
+                <w:i w:val="0"/>
+                <w:color w:val="152536"/>
+                <w:sz w:val="21"/>
+              </w:rPr>
+              <w:t>PASS on the workbook's Checks &amp; Submission sheet confirms that the required fields and structural checks are complete. It does not guarantee full credit or prove that the analysis, evidence, or judgment is correct.</w:t>
+            </w:r>
+          </w:p>
+        </w:tc>
+      </w:tr>
+    </w:tbl>
+    <w:p>
+      <w:pPr>
+        <w:spacing w:after="20"/>
+      </w:pPr>
     </w:p>
     <w:p>
       <w:pPr>

</xml_diff>